<commit_message>
Fase 4 en readme opdateer
</commit_message>
<xml_diff>
--- a/Fases_Dokumentasie/Fase5_Databasis+Finale-Webblad.docx
+++ b/Fases_Dokumentasie/Fase5_Databasis+Finale-Webblad.docx
@@ -1160,10 +1160,7 @@
         </w:numPr>
       </w:pPr>
       <w:r>
-        <w:t xml:space="preserve">Hoeveelheid </w:t>
-      </w:r>
-      <w:r>
-        <w:t>verkoop</w:t>
+        <w:t>Hoeveelheid verkoop</w:t>
       </w:r>
     </w:p>
     <w:p>
@@ -1200,10 +1197,7 @@
         <w:spacing w:after="0"/>
       </w:pPr>
       <w:r>
-        <w:t>Skepping</w:t>
-      </w:r>
-      <w:r>
-        <w:t xml:space="preserve"> se tyd met die verstekwaarde van die huidige tydstempel</w:t>
+        <w:t>Skepping se tyd met die verstekwaarde van die huidige tydstempel</w:t>
       </w:r>
       <w:r>
         <w:t>.</w:t>
@@ -1211,13 +1205,7 @@
     </w:p>
     <w:p>
       <w:r>
-        <w:t xml:space="preserve">Die tabel word outomaties gevul met die huidige </w:t>
-      </w:r>
-      <w:r>
-        <w:t>verkope</w:t>
-      </w:r>
-      <w:r>
-        <w:t xml:space="preserve"> in die sql kode</w:t>
+        <w:t>Die tabel word outomaties gevul met die huidige verkope in die sql kode</w:t>
       </w:r>
       <w:r>
         <w:t xml:space="preserve"> geskryf.</w:t>
@@ -1710,6 +1698,1099 @@
         </w:r>
       </w:hyperlink>
     </w:p>
+    <w:p/>
+    <w:p>
+      <w:pPr>
+        <w:pStyle w:val="Heading2"/>
+        <w:shd w:val="clear" w:color="auto" w:fill="BDD6EE" w:themeFill="accent5" w:themeFillTint="66"/>
+        <w:spacing w:after="240"/>
+        <w:jc w:val="center"/>
+        <w:rPr>
+          <w:b/>
+          <w:bCs/>
+        </w:rPr>
+      </w:pPr>
+      <w:r>
+        <w:rPr>
+          <w:b/>
+          <w:bCs/>
+        </w:rPr>
+        <w:t>Leergidsstruktuur (65 leers)</w:t>
+      </w:r>
+    </w:p>
+    <w:p>
+      <w:r>
+        <w:rPr>
+          <w:b/>
+          <w:bCs/>
+        </w:rPr>
+        <w:t>Skaapboerdery</w:t>
+      </w:r>
+      <w:r>
+        <w:rPr>
+          <w:b/>
+          <w:bCs/>
+        </w:rPr>
+        <w:t>/</w:t>
+      </w:r>
+      <w:r>
+        <w:rPr>
+          <w:b/>
+          <w:bCs/>
+        </w:rPr>
+        <w:br/>
+      </w:r>
+      <w:r>
+        <w:rPr>
+          <w:rFonts w:ascii="MS Gothic" w:eastAsia="MS Gothic" w:hAnsi="MS Gothic" w:cs="MS Gothic" w:hint="eastAsia"/>
+        </w:rPr>
+        <w:t>├</w:t>
+      </w:r>
+      <w:r>
+        <w:rPr>
+          <w:rFonts w:ascii="Calibri" w:hAnsi="Calibri" w:cs="Calibri"/>
+        </w:rPr>
+        <w:t>──</w:t>
+      </w:r>
+      <w:r>
+        <w:t xml:space="preserve"> index.html</w:t>
+      </w:r>
+      <w:r>
+        <w:br/>
+      </w:r>
+      <w:r>
+        <w:rPr>
+          <w:rFonts w:ascii="MS Gothic" w:eastAsia="MS Gothic" w:hAnsi="MS Gothic" w:cs="MS Gothic" w:hint="eastAsia"/>
+        </w:rPr>
+        <w:t>├</w:t>
+      </w:r>
+      <w:r>
+        <w:rPr>
+          <w:rFonts w:ascii="Calibri" w:hAnsi="Calibri" w:cs="Calibri"/>
+        </w:rPr>
+        <w:t>──</w:t>
+      </w:r>
+      <w:r>
+        <w:t xml:space="preserve"> oor_ons.html</w:t>
+      </w:r>
+      <w:r>
+        <w:br/>
+      </w:r>
+      <w:r>
+        <w:rPr>
+          <w:rFonts w:ascii="MS Gothic" w:eastAsia="MS Gothic" w:hAnsi="MS Gothic" w:cs="MS Gothic" w:hint="eastAsia"/>
+        </w:rPr>
+        <w:t>├</w:t>
+      </w:r>
+      <w:r>
+        <w:rPr>
+          <w:rFonts w:ascii="Calibri" w:hAnsi="Calibri" w:cs="Calibri"/>
+        </w:rPr>
+        <w:t>──</w:t>
+      </w:r>
+      <w:r>
+        <w:t xml:space="preserve"> ons_trop.html</w:t>
+      </w:r>
+      <w:r>
+        <w:br/>
+      </w:r>
+      <w:r>
+        <w:rPr>
+          <w:rFonts w:ascii="MS Gothic" w:eastAsia="MS Gothic" w:hAnsi="MS Gothic" w:cs="MS Gothic" w:hint="eastAsia"/>
+        </w:rPr>
+        <w:t>├</w:t>
+      </w:r>
+      <w:r>
+        <w:rPr>
+          <w:rFonts w:ascii="Calibri" w:hAnsi="Calibri" w:cs="Calibri"/>
+        </w:rPr>
+        <w:t>──</w:t>
+      </w:r>
+      <w:r>
+        <w:t xml:space="preserve"> products.html</w:t>
+      </w:r>
+      <w:r>
+        <w:br/>
+      </w:r>
+      <w:r>
+        <w:rPr>
+          <w:rFonts w:ascii="MS Gothic" w:eastAsia="MS Gothic" w:hAnsi="MS Gothic" w:cs="MS Gothic" w:hint="eastAsia"/>
+        </w:rPr>
+        <w:t>├</w:t>
+      </w:r>
+      <w:r>
+        <w:rPr>
+          <w:rFonts w:ascii="Calibri" w:hAnsi="Calibri" w:cs="Calibri"/>
+        </w:rPr>
+        <w:t>──</w:t>
+      </w:r>
+      <w:r>
+        <w:t xml:space="preserve"> voorraadbestuur.html</w:t>
+      </w:r>
+      <w:r>
+        <w:br/>
+      </w:r>
+      <w:r>
+        <w:rPr>
+          <w:rFonts w:ascii="MS Gothic" w:eastAsia="MS Gothic" w:hAnsi="MS Gothic" w:cs="MS Gothic" w:hint="eastAsia"/>
+        </w:rPr>
+        <w:t>├</w:t>
+      </w:r>
+      <w:r>
+        <w:rPr>
+          <w:rFonts w:ascii="Calibri" w:hAnsi="Calibri" w:cs="Calibri"/>
+        </w:rPr>
+        <w:t>──</w:t>
+      </w:r>
+      <w:r>
+        <w:t xml:space="preserve"> verkope_en_rekord.html</w:t>
+      </w:r>
+      <w:r>
+        <w:br/>
+      </w:r>
+      <w:r>
+        <w:rPr>
+          <w:rFonts w:ascii="MS Gothic" w:eastAsia="MS Gothic" w:hAnsi="MS Gothic" w:cs="MS Gothic" w:hint="eastAsia"/>
+        </w:rPr>
+        <w:t>├</w:t>
+      </w:r>
+      <w:r>
+        <w:rPr>
+          <w:rFonts w:ascii="Calibri" w:hAnsi="Calibri" w:cs="Calibri"/>
+        </w:rPr>
+        <w:t>──</w:t>
+      </w:r>
+      <w:r>
+        <w:t xml:space="preserve"> contact.html</w:t>
+      </w:r>
+      <w:r>
+        <w:br/>
+      </w:r>
+      <w:r>
+        <w:rPr>
+          <w:rFonts w:ascii="MS Gothic" w:eastAsia="MS Gothic" w:hAnsi="MS Gothic" w:cs="MS Gothic" w:hint="eastAsia"/>
+        </w:rPr>
+        <w:t>├</w:t>
+      </w:r>
+      <w:r>
+        <w:rPr>
+          <w:rFonts w:ascii="Calibri" w:hAnsi="Calibri" w:cs="Calibri"/>
+        </w:rPr>
+        <w:t>──</w:t>
+      </w:r>
+      <w:r>
+        <w:t xml:space="preserve"> Style.css</w:t>
+      </w:r>
+      <w:r>
+        <w:br/>
+      </w:r>
+      <w:r>
+        <w:rPr>
+          <w:rFonts w:ascii="MS Gothic" w:eastAsia="MS Gothic" w:hAnsi="MS Gothic" w:cs="MS Gothic" w:hint="eastAsia"/>
+        </w:rPr>
+        <w:t>├</w:t>
+      </w:r>
+      <w:r>
+        <w:rPr>
+          <w:rFonts w:ascii="Calibri" w:hAnsi="Calibri" w:cs="Calibri"/>
+        </w:rPr>
+        <w:t>──</w:t>
+      </w:r>
+      <w:r>
+        <w:t xml:space="preserve"> print.css</w:t>
+      </w:r>
+      <w:r>
+        <w:br/>
+      </w:r>
+      <w:r>
+        <w:rPr>
+          <w:rFonts w:ascii="MS Gothic" w:eastAsia="MS Gothic" w:hAnsi="MS Gothic" w:cs="MS Gothic" w:hint="eastAsia"/>
+        </w:rPr>
+        <w:t>├</w:t>
+      </w:r>
+      <w:r>
+        <w:rPr>
+          <w:rFonts w:ascii="Calibri" w:hAnsi="Calibri" w:cs="Calibri"/>
+        </w:rPr>
+        <w:t>──</w:t>
+      </w:r>
+      <w:r>
+        <w:t xml:space="preserve"> script.js</w:t>
+      </w:r>
+      <w:r>
+        <w:br/>
+      </w:r>
+      <w:r>
+        <w:rPr>
+          <w:rFonts w:ascii="MS Gothic" w:eastAsia="MS Gothic" w:hAnsi="MS Gothic" w:cs="MS Gothic" w:hint="eastAsia"/>
+        </w:rPr>
+        <w:t>├</w:t>
+      </w:r>
+      <w:r>
+        <w:rPr>
+          <w:rFonts w:ascii="Calibri" w:hAnsi="Calibri" w:cs="Calibri"/>
+        </w:rPr>
+        <w:t>──</w:t>
+      </w:r>
+      <w:r>
+        <w:t xml:space="preserve"> database.sql</w:t>
+      </w:r>
+      <w:r>
+        <w:br/>
+      </w:r>
+      <w:r>
+        <w:rPr>
+          <w:rFonts w:ascii="MS Gothic" w:eastAsia="MS Gothic" w:hAnsi="MS Gothic" w:cs="MS Gothic" w:hint="eastAsia"/>
+        </w:rPr>
+        <w:t>├</w:t>
+      </w:r>
+      <w:r>
+        <w:rPr>
+          <w:rFonts w:ascii="Calibri" w:hAnsi="Calibri" w:cs="Calibri"/>
+        </w:rPr>
+        <w:t>──</w:t>
+      </w:r>
+      <w:r>
+        <w:t xml:space="preserve"> Bemarking.vtt</w:t>
+      </w:r>
+      <w:r>
+        <w:br/>
+      </w:r>
+      <w:r>
+        <w:rPr>
+          <w:rFonts w:ascii="MS Gothic" w:eastAsia="MS Gothic" w:hAnsi="MS Gothic" w:cs="MS Gothic" w:hint="eastAsia"/>
+        </w:rPr>
+        <w:t>├</w:t>
+      </w:r>
+      <w:r>
+        <w:rPr>
+          <w:rFonts w:ascii="Calibri" w:hAnsi="Calibri" w:cs="Calibri"/>
+        </w:rPr>
+        <w:t>──</w:t>
+      </w:r>
+      <w:r>
+        <w:t xml:space="preserve"> README.md</w:t>
+      </w:r>
+      <w:r>
+        <w:br/>
+      </w:r>
+      <w:r>
+        <w:rPr>
+          <w:rFonts w:ascii="Calibri" w:hAnsi="Calibri" w:cs="Calibri"/>
+        </w:rPr>
+        <w:t xml:space="preserve"> </w:t>
+      </w:r>
+      <w:r>
+        <w:rPr>
+          <w:rFonts w:ascii="Calibri" w:hAnsi="Calibri" w:cs="Calibri"/>
+        </w:rPr>
+        <w:t>│</w:t>
+      </w:r>
+      <w:r>
+        <w:br/>
+      </w:r>
+      <w:r>
+        <w:rPr>
+          <w:rFonts w:ascii="MS Gothic" w:eastAsia="MS Gothic" w:hAnsi="MS Gothic" w:cs="MS Gothic" w:hint="eastAsia"/>
+          <w:b/>
+          <w:bCs/>
+        </w:rPr>
+        <w:t>├</w:t>
+      </w:r>
+      <w:r>
+        <w:rPr>
+          <w:rFonts w:ascii="Calibri" w:hAnsi="Calibri" w:cs="Calibri"/>
+          <w:b/>
+          <w:bCs/>
+        </w:rPr>
+        <w:t>──</w:t>
+      </w:r>
+      <w:r>
+        <w:rPr>
+          <w:b/>
+          <w:bCs/>
+        </w:rPr>
+        <w:t xml:space="preserve"> Media/</w:t>
+      </w:r>
+      <w:r>
+        <w:rPr>
+          <w:b/>
+          <w:bCs/>
+        </w:rPr>
+        <w:br/>
+      </w:r>
+      <w:r>
+        <w:rPr>
+          <w:rFonts w:ascii="Calibri" w:hAnsi="Calibri" w:cs="Calibri"/>
+        </w:rPr>
+        <w:t xml:space="preserve"> </w:t>
+      </w:r>
+      <w:r>
+        <w:rPr>
+          <w:rFonts w:ascii="Calibri" w:hAnsi="Calibri" w:cs="Calibri"/>
+        </w:rPr>
+        <w:t>│</w:t>
+      </w:r>
+      <w:r>
+        <w:t xml:space="preserve"> </w:t>
+      </w:r>
+      <w:r>
+        <w:rPr>
+          <w:rFonts w:ascii="Calibri" w:hAnsi="Calibri" w:cs="Calibri"/>
+        </w:rPr>
+        <w:t>└──</w:t>
+      </w:r>
+      <w:r>
+        <w:t xml:space="preserve"> Alle foto's en video's </w:t>
+      </w:r>
+      <w:r>
+        <w:t xml:space="preserve">in my webblaaie </w:t>
+      </w:r>
+      <w:r>
+        <w:t>is hierbinne (3</w:t>
+      </w:r>
+      <w:r>
+        <w:t>8</w:t>
+      </w:r>
+      <w:r>
+        <w:t xml:space="preserve"> Leers totaal)</w:t>
+      </w:r>
+      <w:r>
+        <w:br/>
+      </w:r>
+      <w:r>
+        <w:rPr>
+          <w:rFonts w:ascii="Calibri" w:hAnsi="Calibri" w:cs="Calibri"/>
+        </w:rPr>
+        <w:t xml:space="preserve"> </w:t>
+      </w:r>
+      <w:r>
+        <w:rPr>
+          <w:rFonts w:ascii="Calibri" w:hAnsi="Calibri" w:cs="Calibri"/>
+        </w:rPr>
+        <w:t>│</w:t>
+      </w:r>
+      <w:r>
+        <w:br/>
+      </w:r>
+      <w:r>
+        <w:rPr>
+          <w:rFonts w:ascii="MS Gothic" w:eastAsia="MS Gothic" w:hAnsi="MS Gothic" w:cs="MS Gothic" w:hint="eastAsia"/>
+          <w:b/>
+          <w:bCs/>
+        </w:rPr>
+        <w:t>├</w:t>
+      </w:r>
+      <w:r>
+        <w:rPr>
+          <w:rFonts w:ascii="Calibri" w:hAnsi="Calibri" w:cs="Calibri"/>
+          <w:b/>
+          <w:bCs/>
+        </w:rPr>
+        <w:t>──</w:t>
+      </w:r>
+      <w:r>
+        <w:rPr>
+          <w:b/>
+          <w:bCs/>
+        </w:rPr>
+        <w:t xml:space="preserve"> Fases_Dokumentasie/</w:t>
+      </w:r>
+      <w:r>
+        <w:rPr>
+          <w:b/>
+          <w:bCs/>
+        </w:rPr>
+        <w:br/>
+      </w:r>
+      <w:r>
+        <w:rPr>
+          <w:rFonts w:ascii="Calibri" w:hAnsi="Calibri" w:cs="Calibri"/>
+        </w:rPr>
+        <w:t xml:space="preserve"> </w:t>
+      </w:r>
+      <w:r>
+        <w:rPr>
+          <w:rFonts w:ascii="Calibri" w:hAnsi="Calibri" w:cs="Calibri"/>
+        </w:rPr>
+        <w:t>│</w:t>
+      </w:r>
+      <w:r>
+        <w:t xml:space="preserve"> </w:t>
+      </w:r>
+      <w:r>
+        <w:rPr>
+          <w:rFonts w:ascii="MS Gothic" w:eastAsia="MS Gothic" w:hAnsi="MS Gothic" w:cs="MS Gothic" w:hint="eastAsia"/>
+        </w:rPr>
+        <w:t>├</w:t>
+      </w:r>
+      <w:r>
+        <w:rPr>
+          <w:rFonts w:ascii="Calibri" w:hAnsi="Calibri" w:cs="Calibri"/>
+        </w:rPr>
+        <w:t>──</w:t>
+      </w:r>
+      <w:r>
+        <w:t xml:space="preserve"> Fase1_Beplaning+Basies-HTML.docx</w:t>
+      </w:r>
+      <w:r>
+        <w:br/>
+      </w:r>
+      <w:r>
+        <w:rPr>
+          <w:rFonts w:ascii="Calibri" w:hAnsi="Calibri" w:cs="Calibri"/>
+        </w:rPr>
+        <w:t xml:space="preserve"> </w:t>
+      </w:r>
+      <w:r>
+        <w:rPr>
+          <w:rFonts w:ascii="Calibri" w:hAnsi="Calibri" w:cs="Calibri"/>
+        </w:rPr>
+        <w:t>│</w:t>
+      </w:r>
+      <w:r>
+        <w:t xml:space="preserve"> </w:t>
+      </w:r>
+      <w:r>
+        <w:rPr>
+          <w:rFonts w:ascii="MS Gothic" w:eastAsia="MS Gothic" w:hAnsi="MS Gothic" w:cs="MS Gothic" w:hint="eastAsia"/>
+        </w:rPr>
+        <w:t>├</w:t>
+      </w:r>
+      <w:r>
+        <w:rPr>
+          <w:rFonts w:ascii="Calibri" w:hAnsi="Calibri" w:cs="Calibri"/>
+        </w:rPr>
+        <w:t>──</w:t>
+      </w:r>
+      <w:r>
+        <w:t xml:space="preserve"> Fase2_CSS+Uitleg.docx</w:t>
+      </w:r>
+      <w:r>
+        <w:br/>
+      </w:r>
+      <w:r>
+        <w:rPr>
+          <w:rFonts w:ascii="Calibri" w:hAnsi="Calibri" w:cs="Calibri"/>
+        </w:rPr>
+        <w:lastRenderedPageBreak/>
+        <w:t xml:space="preserve"> </w:t>
+      </w:r>
+      <w:r>
+        <w:rPr>
+          <w:rFonts w:ascii="Calibri" w:hAnsi="Calibri" w:cs="Calibri"/>
+        </w:rPr>
+        <w:t>│</w:t>
+      </w:r>
+      <w:r>
+        <w:t xml:space="preserve"> </w:t>
+      </w:r>
+      <w:r>
+        <w:rPr>
+          <w:rFonts w:ascii="MS Gothic" w:eastAsia="MS Gothic" w:hAnsi="MS Gothic" w:cs="MS Gothic" w:hint="eastAsia"/>
+        </w:rPr>
+        <w:t>├</w:t>
+      </w:r>
+      <w:r>
+        <w:rPr>
+          <w:rFonts w:ascii="Calibri" w:hAnsi="Calibri" w:cs="Calibri"/>
+        </w:rPr>
+        <w:t>──</w:t>
+      </w:r>
+      <w:r>
+        <w:t xml:space="preserve"> Fase3_Reponsief+Tabelle+Webvorm.docx</w:t>
+      </w:r>
+      <w:r>
+        <w:br/>
+      </w:r>
+      <w:r>
+        <w:rPr>
+          <w:rFonts w:ascii="Calibri" w:hAnsi="Calibri" w:cs="Calibri"/>
+        </w:rPr>
+        <w:t xml:space="preserve"> </w:t>
+      </w:r>
+      <w:r>
+        <w:rPr>
+          <w:rFonts w:ascii="Calibri" w:hAnsi="Calibri" w:cs="Calibri"/>
+        </w:rPr>
+        <w:t>│</w:t>
+      </w:r>
+      <w:r>
+        <w:t xml:space="preserve"> </w:t>
+      </w:r>
+      <w:r>
+        <w:rPr>
+          <w:rFonts w:ascii="MS Gothic" w:eastAsia="MS Gothic" w:hAnsi="MS Gothic" w:cs="MS Gothic" w:hint="eastAsia"/>
+        </w:rPr>
+        <w:t>├</w:t>
+      </w:r>
+      <w:r>
+        <w:rPr>
+          <w:rFonts w:ascii="Calibri" w:hAnsi="Calibri" w:cs="Calibri"/>
+        </w:rPr>
+        <w:t>──</w:t>
+      </w:r>
+      <w:r>
+        <w:t xml:space="preserve"> Fase4_JS+Multimedia.docx</w:t>
+      </w:r>
+      <w:r>
+        <w:br/>
+      </w:r>
+      <w:r>
+        <w:rPr>
+          <w:rFonts w:ascii="Calibri" w:hAnsi="Calibri" w:cs="Calibri"/>
+        </w:rPr>
+        <w:t xml:space="preserve"> </w:t>
+      </w:r>
+      <w:r>
+        <w:rPr>
+          <w:rFonts w:ascii="Calibri" w:hAnsi="Calibri" w:cs="Calibri"/>
+        </w:rPr>
+        <w:t>│</w:t>
+      </w:r>
+      <w:r>
+        <w:t xml:space="preserve"> </w:t>
+      </w:r>
+      <w:r>
+        <w:rPr>
+          <w:rFonts w:ascii="MS Gothic" w:eastAsia="MS Gothic" w:hAnsi="MS Gothic" w:cs="MS Gothic" w:hint="eastAsia"/>
+        </w:rPr>
+        <w:t>├</w:t>
+      </w:r>
+      <w:r>
+        <w:rPr>
+          <w:rFonts w:ascii="Calibri" w:hAnsi="Calibri" w:cs="Calibri"/>
+        </w:rPr>
+        <w:t>──</w:t>
+      </w:r>
+      <w:r>
+        <w:t xml:space="preserve"> Fase5_Databasis+Finale-Webblad.docx</w:t>
+      </w:r>
+      <w:r>
+        <w:br/>
+      </w:r>
+      <w:r>
+        <w:t xml:space="preserve"> </w:t>
+      </w:r>
+      <w:r>
+        <w:t xml:space="preserve">│ </w:t>
+      </w:r>
+      <w:r>
+        <w:rPr>
+          <w:rFonts w:ascii="MS Gothic" w:eastAsia="MS Gothic" w:hAnsi="MS Gothic" w:cs="MS Gothic" w:hint="eastAsia"/>
+        </w:rPr>
+        <w:t>├</w:t>
+      </w:r>
+      <w:r>
+        <w:rPr>
+          <w:rFonts w:ascii="Calibri" w:hAnsi="Calibri" w:cs="Calibri"/>
+        </w:rPr>
+        <w:t>──</w:t>
+      </w:r>
+      <w:r>
+        <w:t xml:space="preserve"> BuiteHanboekCode.docx</w:t>
+      </w:r>
+      <w:r>
+        <w:br/>
+      </w:r>
+      <w:r>
+        <w:rPr>
+          <w:rFonts w:ascii="Calibri" w:hAnsi="Calibri" w:cs="Calibri"/>
+        </w:rPr>
+        <w:t xml:space="preserve"> </w:t>
+      </w:r>
+      <w:r>
+        <w:rPr>
+          <w:rFonts w:ascii="Calibri" w:hAnsi="Calibri" w:cs="Calibri"/>
+        </w:rPr>
+        <w:t>│</w:t>
+      </w:r>
+      <w:r>
+        <w:t xml:space="preserve"> </w:t>
+      </w:r>
+      <w:r>
+        <w:rPr>
+          <w:rFonts w:ascii="MS Gothic" w:eastAsia="MS Gothic" w:hAnsi="MS Gothic" w:cs="MS Gothic" w:hint="eastAsia"/>
+        </w:rPr>
+        <w:t>├</w:t>
+      </w:r>
+      <w:r>
+        <w:rPr>
+          <w:rFonts w:ascii="Calibri" w:hAnsi="Calibri" w:cs="Calibri"/>
+        </w:rPr>
+        <w:t>──</w:t>
+      </w:r>
+      <w:r>
+        <w:t xml:space="preserve"> Hanboek&amp;ProjekVoorkom.docx</w:t>
+      </w:r>
+      <w:r>
+        <w:br/>
+      </w:r>
+      <w:r>
+        <w:rPr>
+          <w:rFonts w:ascii="Calibri" w:hAnsi="Calibri" w:cs="Calibri"/>
+        </w:rPr>
+        <w:t xml:space="preserve"> </w:t>
+      </w:r>
+      <w:r>
+        <w:rPr>
+          <w:rFonts w:ascii="Calibri" w:hAnsi="Calibri" w:cs="Calibri"/>
+        </w:rPr>
+        <w:t>│</w:t>
+      </w:r>
+      <w:r>
+        <w:t xml:space="preserve"> </w:t>
+      </w:r>
+      <w:r>
+        <w:t xml:space="preserve"> </w:t>
+      </w:r>
+      <w:r>
+        <w:rPr>
+          <w:rFonts w:ascii="Calibri" w:hAnsi="Calibri" w:cs="Calibri"/>
+        </w:rPr>
+        <w:t>└──</w:t>
+      </w:r>
+      <w:r>
+        <w:t xml:space="preserve"> KI_media.docx</w:t>
+      </w:r>
+      <w:r>
+        <w:br/>
+      </w:r>
+      <w:r>
+        <w:rPr>
+          <w:rFonts w:ascii="Calibri" w:hAnsi="Calibri" w:cs="Calibri"/>
+        </w:rPr>
+        <w:t xml:space="preserve"> </w:t>
+      </w:r>
+      <w:r>
+        <w:rPr>
+          <w:rFonts w:ascii="Calibri" w:hAnsi="Calibri" w:cs="Calibri"/>
+        </w:rPr>
+        <w:t>│</w:t>
+      </w:r>
+      <w:r>
+        <w:br/>
+      </w:r>
+      <w:r>
+        <w:rPr>
+          <w:rFonts w:ascii="Calibri" w:hAnsi="Calibri" w:cs="Calibri"/>
+          <w:b/>
+          <w:bCs/>
+        </w:rPr>
+        <w:t xml:space="preserve"> </w:t>
+      </w:r>
+      <w:r>
+        <w:rPr>
+          <w:rFonts w:ascii="Calibri" w:hAnsi="Calibri" w:cs="Calibri"/>
+          <w:b/>
+          <w:bCs/>
+        </w:rPr>
+        <w:t>└──</w:t>
+      </w:r>
+      <w:r>
+        <w:rPr>
+          <w:b/>
+          <w:bCs/>
+        </w:rPr>
+        <w:t xml:space="preserve"> Skermskote en Video/</w:t>
+      </w:r>
+      <w:r>
+        <w:rPr>
+          <w:b/>
+          <w:bCs/>
+        </w:rPr>
+        <w:br/>
+      </w:r>
+      <w:r>
+        <w:rPr>
+          <w:rFonts w:ascii="MS Gothic" w:eastAsia="MS Gothic" w:hAnsi="MS Gothic" w:cs="MS Gothic" w:hint="eastAsia"/>
+          <w:b/>
+          <w:bCs/>
+        </w:rPr>
+        <w:t>├</w:t>
+      </w:r>
+      <w:r>
+        <w:rPr>
+          <w:rFonts w:ascii="Calibri" w:hAnsi="Calibri" w:cs="Calibri"/>
+          <w:b/>
+          <w:bCs/>
+          <w:i/>
+          <w:iCs/>
+        </w:rPr>
+        <w:t>──</w:t>
+      </w:r>
+      <w:r>
+        <w:rPr>
+          <w:b/>
+          <w:bCs/>
+          <w:i/>
+          <w:iCs/>
+        </w:rPr>
+        <w:t xml:space="preserve"> Fase2</w:t>
+      </w:r>
+      <w:r>
+        <w:rPr>
+          <w:b/>
+          <w:bCs/>
+          <w:i/>
+          <w:iCs/>
+        </w:rPr>
+        <w:t xml:space="preserve"> </w:t>
+      </w:r>
+      <w:r>
+        <w:rPr>
+          <w:b/>
+          <w:bCs/>
+          <w:i/>
+          <w:iCs/>
+        </w:rPr>
+        <w:t>-</w:t>
+      </w:r>
+      <w:r>
+        <w:rPr>
+          <w:b/>
+          <w:bCs/>
+          <w:i/>
+          <w:iCs/>
+        </w:rPr>
+        <w:t xml:space="preserve"> </w:t>
+      </w:r>
+      <w:r>
+        <w:rPr>
+          <w:b/>
+          <w:bCs/>
+          <w:i/>
+          <w:iCs/>
+        </w:rPr>
+        <w:t>3Blaaie/</w:t>
+      </w:r>
+      <w:r>
+        <w:rPr>
+          <w:b/>
+          <w:bCs/>
+          <w:i/>
+          <w:iCs/>
+        </w:rPr>
+        <w:br/>
+      </w:r>
+      <w:r>
+        <w:rPr>
+          <w:i/>
+          <w:iCs/>
+        </w:rPr>
+        <w:t xml:space="preserve"> </w:t>
+      </w:r>
+      <w:r>
+        <w:rPr>
+          <w:i/>
+          <w:iCs/>
+        </w:rPr>
+        <w:t xml:space="preserve">│ </w:t>
+      </w:r>
+      <w:r>
+        <w:rPr>
+          <w:rFonts w:ascii="MS Gothic" w:eastAsia="MS Gothic" w:hAnsi="MS Gothic" w:cs="MS Gothic" w:hint="eastAsia"/>
+        </w:rPr>
+        <w:t>├</w:t>
+      </w:r>
+      <w:r>
+        <w:rPr>
+          <w:rFonts w:ascii="Calibri" w:hAnsi="Calibri" w:cs="Calibri"/>
+          <w:i/>
+          <w:iCs/>
+        </w:rPr>
+        <w:t>──</w:t>
+      </w:r>
+      <w:r>
+        <w:rPr>
+          <w:i/>
+          <w:iCs/>
+        </w:rPr>
+        <w:t xml:space="preserve"> Tuisblad_Skermskoot.png</w:t>
+      </w:r>
+      <w:r>
+        <w:rPr>
+          <w:i/>
+          <w:iCs/>
+        </w:rPr>
+        <w:br/>
+      </w:r>
+      <w:r>
+        <w:rPr>
+          <w:rFonts w:ascii="Calibri" w:hAnsi="Calibri" w:cs="Calibri"/>
+          <w:i/>
+          <w:iCs/>
+        </w:rPr>
+        <w:t xml:space="preserve"> </w:t>
+      </w:r>
+      <w:r>
+        <w:rPr>
+          <w:rFonts w:ascii="Calibri" w:hAnsi="Calibri" w:cs="Calibri"/>
+          <w:i/>
+          <w:iCs/>
+        </w:rPr>
+        <w:t>│</w:t>
+      </w:r>
+      <w:r>
+        <w:rPr>
+          <w:i/>
+          <w:iCs/>
+        </w:rPr>
+        <w:t xml:space="preserve"> </w:t>
+      </w:r>
+      <w:r>
+        <w:rPr>
+          <w:rFonts w:ascii="MS Gothic" w:eastAsia="MS Gothic" w:hAnsi="MS Gothic" w:cs="MS Gothic" w:hint="eastAsia"/>
+        </w:rPr>
+        <w:t>├</w:t>
+      </w:r>
+      <w:r>
+        <w:rPr>
+          <w:rFonts w:ascii="Calibri" w:hAnsi="Calibri" w:cs="Calibri"/>
+          <w:i/>
+          <w:iCs/>
+        </w:rPr>
+        <w:t>──</w:t>
+      </w:r>
+      <w:r>
+        <w:rPr>
+          <w:i/>
+          <w:iCs/>
+        </w:rPr>
+        <w:t xml:space="preserve"> OorOnsBlad_Skermskoot.png</w:t>
+      </w:r>
+      <w:r>
+        <w:rPr>
+          <w:i/>
+          <w:iCs/>
+        </w:rPr>
+        <w:br/>
+      </w:r>
+      <w:r>
+        <w:rPr>
+          <w:rFonts w:ascii="Calibri" w:hAnsi="Calibri" w:cs="Calibri"/>
+          <w:i/>
+          <w:iCs/>
+        </w:rPr>
+        <w:t xml:space="preserve"> </w:t>
+      </w:r>
+      <w:r>
+        <w:rPr>
+          <w:rFonts w:ascii="Calibri" w:hAnsi="Calibri" w:cs="Calibri"/>
+          <w:i/>
+          <w:iCs/>
+        </w:rPr>
+        <w:t>│</w:t>
+      </w:r>
+      <w:r>
+        <w:rPr>
+          <w:rFonts w:ascii="Calibri" w:hAnsi="Calibri" w:cs="Calibri"/>
+          <w:i/>
+          <w:iCs/>
+        </w:rPr>
+        <w:t xml:space="preserve"> </w:t>
+      </w:r>
+      <w:r>
+        <w:rPr>
+          <w:i/>
+          <w:iCs/>
+        </w:rPr>
+        <w:t xml:space="preserve"> </w:t>
+      </w:r>
+      <w:r>
+        <w:rPr>
+          <w:rFonts w:ascii="Calibri" w:hAnsi="Calibri" w:cs="Calibri"/>
+          <w:i/>
+          <w:iCs/>
+        </w:rPr>
+        <w:t>└──</w:t>
+      </w:r>
+      <w:r>
+        <w:rPr>
+          <w:i/>
+          <w:iCs/>
+        </w:rPr>
+        <w:t xml:space="preserve"> ProdukteBlad_Skermskoot.png</w:t>
+      </w:r>
+      <w:r>
+        <w:rPr>
+          <w:i/>
+          <w:iCs/>
+        </w:rPr>
+        <w:br/>
+      </w:r>
+      <w:r>
+        <w:rPr>
+          <w:rFonts w:ascii="MS Gothic" w:eastAsia="MS Gothic" w:hAnsi="MS Gothic" w:cs="MS Gothic" w:hint="eastAsia"/>
+          <w:b/>
+          <w:bCs/>
+        </w:rPr>
+        <w:t>├</w:t>
+      </w:r>
+      <w:r>
+        <w:rPr>
+          <w:rFonts w:ascii="Calibri" w:hAnsi="Calibri" w:cs="Calibri"/>
+          <w:b/>
+          <w:bCs/>
+        </w:rPr>
+        <w:t>──</w:t>
+      </w:r>
+      <w:r>
+        <w:rPr>
+          <w:b/>
+          <w:bCs/>
+        </w:rPr>
+        <w:t xml:space="preserve"> Fase5</w:t>
+      </w:r>
+      <w:r>
+        <w:rPr>
+          <w:b/>
+          <w:bCs/>
+        </w:rPr>
+        <w:t xml:space="preserve"> </w:t>
+      </w:r>
+      <w:r>
+        <w:rPr>
+          <w:b/>
+          <w:bCs/>
+        </w:rPr>
+        <w:t>-</w:t>
+      </w:r>
+      <w:r>
+        <w:rPr>
+          <w:b/>
+          <w:bCs/>
+        </w:rPr>
+        <w:t xml:space="preserve"> </w:t>
+      </w:r>
+      <w:r>
+        <w:rPr>
+          <w:b/>
+          <w:bCs/>
+        </w:rPr>
+        <w:t>FinaleDemo/</w:t>
+      </w:r>
+      <w:r>
+        <w:rPr>
+          <w:b/>
+          <w:bCs/>
+        </w:rPr>
+        <w:br/>
+      </w:r>
+      <w:r>
+        <w:rPr>
+          <w:rFonts w:ascii="Calibri" w:hAnsi="Calibri" w:cs="Calibri"/>
+          <w:i/>
+          <w:iCs/>
+        </w:rPr>
+        <w:t xml:space="preserve"> </w:t>
+      </w:r>
+      <w:r>
+        <w:rPr>
+          <w:rFonts w:ascii="Calibri" w:hAnsi="Calibri" w:cs="Calibri"/>
+          <w:i/>
+          <w:iCs/>
+        </w:rPr>
+        <w:t>│</w:t>
+      </w:r>
+      <w:r>
+        <w:rPr>
+          <w:i/>
+          <w:iCs/>
+        </w:rPr>
+        <w:t xml:space="preserve"> </w:t>
+      </w:r>
+      <w:r>
+        <w:rPr>
+          <w:rFonts w:ascii="MS Gothic" w:eastAsia="MS Gothic" w:hAnsi="MS Gothic" w:cs="MS Gothic" w:hint="eastAsia"/>
+        </w:rPr>
+        <w:t>├</w:t>
+      </w:r>
+      <w:r>
+        <w:rPr>
+          <w:rFonts w:ascii="Calibri" w:hAnsi="Calibri" w:cs="Calibri"/>
+        </w:rPr>
+        <w:t>──</w:t>
+      </w:r>
+      <w:r>
+        <w:t xml:space="preserve"> Rekenaarskerm.mp4</w:t>
+      </w:r>
+      <w:r>
+        <w:br/>
+      </w:r>
+      <w:r>
+        <w:rPr>
+          <w:rFonts w:ascii="Calibri" w:hAnsi="Calibri" w:cs="Calibri"/>
+          <w:i/>
+          <w:iCs/>
+        </w:rPr>
+        <w:t xml:space="preserve"> </w:t>
+      </w:r>
+      <w:r>
+        <w:rPr>
+          <w:rFonts w:ascii="Calibri" w:hAnsi="Calibri" w:cs="Calibri"/>
+          <w:i/>
+          <w:iCs/>
+        </w:rPr>
+        <w:t>│</w:t>
+      </w:r>
+      <w:r>
+        <w:rPr>
+          <w:i/>
+          <w:iCs/>
+        </w:rPr>
+        <w:t xml:space="preserve"> </w:t>
+      </w:r>
+      <w:r>
+        <w:rPr>
+          <w:rFonts w:ascii="MS Gothic" w:eastAsia="MS Gothic" w:hAnsi="MS Gothic" w:cs="MS Gothic" w:hint="eastAsia"/>
+        </w:rPr>
+        <w:t>├</w:t>
+      </w:r>
+      <w:r>
+        <w:rPr>
+          <w:rFonts w:ascii="Calibri" w:hAnsi="Calibri" w:cs="Calibri"/>
+        </w:rPr>
+        <w:t>──</w:t>
+      </w:r>
+      <w:r>
+        <w:rPr>
+          <w:rFonts w:ascii="Calibri" w:hAnsi="Calibri" w:cs="Calibri"/>
+        </w:rPr>
+        <w:t xml:space="preserve"> Tabletskerm.mp4</w:t>
+      </w:r>
+      <w:r>
+        <w:br/>
+      </w:r>
+      <w:r>
+        <w:rPr>
+          <w:rFonts w:ascii="Calibri" w:hAnsi="Calibri" w:cs="Calibri"/>
+        </w:rPr>
+        <w:t xml:space="preserve"> </w:t>
+      </w:r>
+      <w:r>
+        <w:rPr>
+          <w:rFonts w:ascii="Calibri" w:hAnsi="Calibri" w:cs="Calibri"/>
+        </w:rPr>
+        <w:t xml:space="preserve">   </w:t>
+      </w:r>
+      <w:r>
+        <w:rPr>
+          <w:rFonts w:ascii="Calibri" w:hAnsi="Calibri" w:cs="Calibri"/>
+        </w:rPr>
+        <w:t xml:space="preserve"> </w:t>
+      </w:r>
+      <w:r>
+        <w:rPr>
+          <w:rFonts w:ascii="Calibri" w:hAnsi="Calibri" w:cs="Calibri"/>
+        </w:rPr>
+        <w:t>└──</w:t>
+      </w:r>
+      <w:r>
+        <w:t xml:space="preserve"> Slimfoon.mp4</w:t>
+      </w:r>
+    </w:p>
+    <w:p/>
     <w:sectPr>
       <w:pgSz w:w="11906" w:h="16838" w:code="9"/>
       <w:pgMar w:top="1440" w:right="1440" w:bottom="1440" w:left="1440" w:header="708" w:footer="708" w:gutter="0"/>

</xml_diff>